<commit_message>
solicitude de informacion larga estancia
</commit_message>
<xml_diff>
--- a/docs/twilio para wathsapp aplicacion.docx
+++ b/docs/twilio para wathsapp aplicacion.docx
@@ -126,52 +126,19 @@
       </w:pPr>
       <w:r>
         <w:rPr/>
-      </w:r>
-    </w:p>
-    <w:p>
-      <w:pPr>
-        <w:pStyle w:val="Normal"/>
-        <w:bidi w:val="0"/>
-        <w:jc w:val="left"/>
-        <w:rPr/>
-      </w:pPr>
-      <w:r>
-        <w:rPr/>
-      </w:r>
-    </w:p>
-    <w:p>
-      <w:pPr>
-        <w:pStyle w:val="Normal"/>
-        <w:bidi w:val="0"/>
-        <w:jc w:val="left"/>
-        <w:rPr/>
-      </w:pPr>
-      <w:r>
-        <w:rPr/>
-      </w:r>
-    </w:p>
-    <w:p>
-      <w:pPr>
-        <w:pStyle w:val="Normal"/>
-        <w:bidi w:val="0"/>
-        <w:jc w:val="left"/>
-        <w:rPr/>
-      </w:pPr>
-      <w:r>
-        <w:rPr/>
         <w:drawing>
-          <wp:anchor behindDoc="0" distT="0" distB="0" distL="0" distR="0" simplePos="0" locked="0" layoutInCell="0" allowOverlap="1" relativeHeight="2">
+          <wp:anchor behindDoc="0" distT="0" distB="0" distL="0" distR="0" simplePos="0" locked="0" layoutInCell="0" allowOverlap="1" relativeHeight="7">
             <wp:simplePos x="0" y="0"/>
             <wp:positionH relativeFrom="column">
-              <wp:posOffset>0</wp:posOffset>
+              <wp:align>center</wp:align>
             </wp:positionH>
             <wp:positionV relativeFrom="paragraph">
-              <wp:posOffset>86995</wp:posOffset>
+              <wp:posOffset>635</wp:posOffset>
             </wp:positionV>
             <wp:extent cx="6120130" cy="3442335"/>
             <wp:effectExtent l="0" t="0" r="0" b="0"/>
             <wp:wrapSquare wrapText="largest"/>
-            <wp:docPr id="1" name="Imagen1" descr=""/>
+            <wp:docPr id="1" name="Imagen6" descr=""/>
             <wp:cNvGraphicFramePr>
               <a:graphicFrameLocks xmlns:a="http://schemas.openxmlformats.org/drawingml/2006/main" noChangeAspect="1"/>
             </wp:cNvGraphicFramePr>
@@ -179,7 +146,7 @@
               <a:graphicData uri="http://schemas.openxmlformats.org/drawingml/2006/picture">
                 <pic:pic xmlns:pic="http://schemas.openxmlformats.org/drawingml/2006/picture">
                   <pic:nvPicPr>
-                    <pic:cNvPr id="1" name="Imagen1" descr=""/>
+                    <pic:cNvPr id="1" name="Imagen6" descr=""/>
                     <pic:cNvPicPr>
                       <a:picLocks noChangeAspect="1" noChangeArrowheads="1"/>
                     </pic:cNvPicPr>
@@ -215,19 +182,41 @@
       </w:pPr>
       <w:r>
         <w:rPr/>
+      </w:r>
+    </w:p>
+    <w:p>
+      <w:pPr>
+        <w:pStyle w:val="Normal"/>
+        <w:bidi w:val="0"/>
+        <w:jc w:val="left"/>
+        <w:rPr/>
+      </w:pPr>
+      <w:r>
+        <w:rPr/>
+      </w:r>
+    </w:p>
+    <w:p>
+      <w:pPr>
+        <w:pStyle w:val="Normal"/>
+        <w:bidi w:val="0"/>
+        <w:jc w:val="left"/>
+        <w:rPr/>
+      </w:pPr>
+      <w:r>
+        <w:rPr/>
         <w:drawing>
-          <wp:anchor behindDoc="0" distT="0" distB="0" distL="0" distR="0" simplePos="0" locked="0" layoutInCell="0" allowOverlap="1" relativeHeight="3">
+          <wp:anchor behindDoc="0" distT="0" distB="0" distL="0" distR="0" simplePos="0" locked="0" layoutInCell="0" allowOverlap="1" relativeHeight="2">
             <wp:simplePos x="0" y="0"/>
             <wp:positionH relativeFrom="column">
-              <wp:align>center</wp:align>
+              <wp:posOffset>0</wp:posOffset>
             </wp:positionH>
             <wp:positionV relativeFrom="paragraph">
-              <wp:posOffset>635</wp:posOffset>
+              <wp:posOffset>86995</wp:posOffset>
             </wp:positionV>
             <wp:extent cx="6120130" cy="3442335"/>
             <wp:effectExtent l="0" t="0" r="0" b="0"/>
             <wp:wrapSquare wrapText="largest"/>
-            <wp:docPr id="2" name="Imagen2" descr=""/>
+            <wp:docPr id="2" name="Imagen1" descr=""/>
             <wp:cNvGraphicFramePr>
               <a:graphicFrameLocks xmlns:a="http://schemas.openxmlformats.org/drawingml/2006/main" noChangeAspect="1"/>
             </wp:cNvGraphicFramePr>
@@ -235,7 +224,7 @@
               <a:graphicData uri="http://schemas.openxmlformats.org/drawingml/2006/picture">
                 <pic:pic xmlns:pic="http://schemas.openxmlformats.org/drawingml/2006/picture">
                   <pic:nvPicPr>
-                    <pic:cNvPr id="2" name="Imagen2" descr=""/>
+                    <pic:cNvPr id="2" name="Imagen1" descr=""/>
                     <pic:cNvPicPr>
                       <a:picLocks noChangeAspect="1" noChangeArrowheads="1"/>
                     </pic:cNvPicPr>
@@ -266,10 +255,67 @@
       <w:pPr>
         <w:pStyle w:val="Normal"/>
         <w:bidi w:val="0"/>
-        <w:spacing w:lineRule="auto" w:line="300" w:before="0" w:after="0"/>
-        <w:ind w:left="0" w:right="0" w:hanging="0"/>
-        <w:jc w:val="left"/>
-        <w:rPr>
+        <w:jc w:val="left"/>
+        <w:rPr/>
+      </w:pPr>
+      <w:r>
+        <w:rPr/>
+        <w:drawing>
+          <wp:anchor behindDoc="0" distT="0" distB="0" distL="0" distR="0" simplePos="0" locked="0" layoutInCell="0" allowOverlap="1" relativeHeight="3">
+            <wp:simplePos x="0" y="0"/>
+            <wp:positionH relativeFrom="column">
+              <wp:align>center</wp:align>
+            </wp:positionH>
+            <wp:positionV relativeFrom="paragraph">
+              <wp:posOffset>635</wp:posOffset>
+            </wp:positionV>
+            <wp:extent cx="6120130" cy="3442335"/>
+            <wp:effectExtent l="0" t="0" r="0" b="0"/>
+            <wp:wrapSquare wrapText="largest"/>
+            <wp:docPr id="3" name="Imagen2" descr=""/>
+            <wp:cNvGraphicFramePr>
+              <a:graphicFrameLocks xmlns:a="http://schemas.openxmlformats.org/drawingml/2006/main" noChangeAspect="1"/>
+            </wp:cNvGraphicFramePr>
+            <a:graphic xmlns:a="http://schemas.openxmlformats.org/drawingml/2006/main">
+              <a:graphicData uri="http://schemas.openxmlformats.org/drawingml/2006/picture">
+                <pic:pic xmlns:pic="http://schemas.openxmlformats.org/drawingml/2006/picture">
+                  <pic:nvPicPr>
+                    <pic:cNvPr id="3" name="Imagen2" descr=""/>
+                    <pic:cNvPicPr>
+                      <a:picLocks noChangeAspect="1" noChangeArrowheads="1"/>
+                    </pic:cNvPicPr>
+                  </pic:nvPicPr>
+                  <pic:blipFill>
+                    <a:blip r:embed="rId4"/>
+                    <a:stretch>
+                      <a:fillRect/>
+                    </a:stretch>
+                  </pic:blipFill>
+                  <pic:spPr bwMode="auto">
+                    <a:xfrm>
+                      <a:off x="0" y="0"/>
+                      <a:ext cx="6120130" cy="3442335"/>
+                    </a:xfrm>
+                    <a:prstGeom prst="rect">
+                      <a:avLst/>
+                    </a:prstGeom>
+                  </pic:spPr>
+                </pic:pic>
+              </a:graphicData>
+            </a:graphic>
+          </wp:anchor>
+        </w:drawing>
+      </w:r>
+    </w:p>
+    <w:p>
+      <w:pPr>
+        <w:pStyle w:val="Normal"/>
+        <w:bidi w:val="0"/>
+        <w:spacing w:lineRule="auto" w:line="300" w:before="0" w:after="0"/>
+        <w:ind w:left="0" w:right="0" w:hanging="0"/>
+        <w:jc w:val="left"/>
+        <w:rPr>
+          <w:b/>
           <w:b/>
           <w:color w:val="121C2D"/>
         </w:rPr>
@@ -361,7 +407,7 @@
         </w:rPr>
         <w:t> Guarda tu token de forma segura para proteger tu cuenta. </w:t>
       </w:r>
-      <w:hyperlink r:id="rId4" w:tgtFrame="_blank">
+      <w:hyperlink r:id="rId5" w:tgtFrame="_blank">
         <w:r>
           <w:rPr>
             <w:rStyle w:val="EnlacedeInternet"/>
@@ -409,6 +455,8 @@
         <w:rPr>
           <w:rFonts w:ascii="TwilioSansText;Inter var experimental;Inter var;apple-system;BlinkMacSystemFont;Segoe UI;Roboto;Oxygen-Sans;Ubuntu;Cantarell;Helvetica Neue;sans-serif" w:hAnsi="TwilioSansText;Inter var experimental;Inter var;apple-system;BlinkMacSystemFont;Segoe UI;Roboto;Oxygen-Sans;Ubuntu;Cantarell;Helvetica Neue;sans-serif"/>
           <w:b w:val="false"/>
+          <w:b w:val="false"/>
+          <w:i w:val="false"/>
           <w:i w:val="false"/>
           <w:caps w:val="false"/>
           <w:smallCaps w:val="false"/>
@@ -510,6 +558,8 @@
         <w:rPr>
           <w:rFonts w:ascii="TwilioSansText;Inter var experimental;Inter var;apple-system;BlinkMacSystemFont;Segoe UI;Roboto;Oxygen-Sans;Ubuntu;Cantarell;Helvetica Neue;sans-serif" w:hAnsi="TwilioSansText;Inter var experimental;Inter var;apple-system;BlinkMacSystemFont;Segoe UI;Roboto;Oxygen-Sans;Ubuntu;Cantarell;Helvetica Neue;sans-serif"/>
           <w:b w:val="false"/>
+          <w:b w:val="false"/>
+          <w:i w:val="false"/>
           <w:i w:val="false"/>
           <w:caps w:val="false"/>
           <w:smallCaps w:val="false"/>
@@ -628,6 +678,90 @@
       <w:r>
         <w:rPr/>
         <w:t>ir0SNxVZuV0mXK16V3S0eGVn0jceJYJ3</w:t>
+      </w:r>
+    </w:p>
+    <w:p>
+      <w:pPr>
+        <w:pStyle w:val="Normal"/>
+        <w:widowControl/>
+        <w:bidi w:val="0"/>
+        <w:spacing w:lineRule="auto" w:line="300" w:before="0" w:after="0"/>
+        <w:ind w:left="0" w:right="0" w:hanging="0"/>
+        <w:jc w:val="left"/>
+        <w:rPr/>
+      </w:pPr>
+      <w:r>
+        <w:rPr/>
+      </w:r>
+    </w:p>
+    <w:p>
+      <w:pPr>
+        <w:pStyle w:val="Normal"/>
+        <w:widowControl/>
+        <w:bidi w:val="0"/>
+        <w:spacing w:lineRule="auto" w:line="300" w:before="0" w:after="0"/>
+        <w:ind w:left="0" w:right="0" w:hanging="0"/>
+        <w:jc w:val="left"/>
+        <w:rPr/>
+      </w:pPr>
+      <w:r>
+        <w:rPr/>
+      </w:r>
+    </w:p>
+    <w:p>
+      <w:pPr>
+        <w:pStyle w:val="Normal"/>
+        <w:widowControl/>
+        <w:bidi w:val="0"/>
+        <w:spacing w:lineRule="auto" w:line="300" w:before="0" w:after="0"/>
+        <w:ind w:left="0" w:right="0" w:hanging="0"/>
+        <w:jc w:val="left"/>
+        <w:rPr/>
+      </w:pPr>
+      <w:r>
+        <w:rPr/>
+      </w:r>
+    </w:p>
+    <w:p>
+      <w:pPr>
+        <w:pStyle w:val="Normal"/>
+        <w:widowControl/>
+        <w:bidi w:val="0"/>
+        <w:spacing w:lineRule="auto" w:line="300" w:before="0" w:after="0"/>
+        <w:ind w:left="0" w:right="0" w:hanging="0"/>
+        <w:jc w:val="left"/>
+        <w:rPr/>
+      </w:pPr>
+      <w:r>
+        <w:rPr/>
+      </w:r>
+    </w:p>
+    <w:p>
+      <w:pPr>
+        <w:pStyle w:val="Normal"/>
+        <w:widowControl/>
+        <w:bidi w:val="0"/>
+        <w:spacing w:lineRule="auto" w:line="300" w:before="0" w:after="0"/>
+        <w:ind w:left="0" w:right="0" w:hanging="0"/>
+        <w:jc w:val="left"/>
+        <w:rPr/>
+      </w:pPr>
+      <w:r>
+        <w:rPr/>
+      </w:r>
+    </w:p>
+    <w:p>
+      <w:pPr>
+        <w:pStyle w:val="Normal"/>
+        <w:widowControl/>
+        <w:bidi w:val="0"/>
+        <w:spacing w:lineRule="auto" w:line="300" w:before="0" w:after="0"/>
+        <w:ind w:left="0" w:right="0" w:hanging="0"/>
+        <w:jc w:val="left"/>
+        <w:rPr/>
+      </w:pPr>
+      <w:r>
+        <w:rPr/>
       </w:r>
     </w:p>
     <w:p>
@@ -752,7 +886,7 @@
             <wp:extent cx="6120130" cy="3442335"/>
             <wp:effectExtent l="0" t="0" r="0" b="0"/>
             <wp:wrapSquare wrapText="largest"/>
-            <wp:docPr id="3" name="Imagen3" descr=""/>
+            <wp:docPr id="4" name="Imagen3" descr=""/>
             <wp:cNvGraphicFramePr>
               <a:graphicFrameLocks xmlns:a="http://schemas.openxmlformats.org/drawingml/2006/main" noChangeAspect="1"/>
             </wp:cNvGraphicFramePr>
@@ -760,13 +894,13 @@
               <a:graphicData uri="http://schemas.openxmlformats.org/drawingml/2006/picture">
                 <pic:pic xmlns:pic="http://schemas.openxmlformats.org/drawingml/2006/picture">
                   <pic:nvPicPr>
-                    <pic:cNvPr id="3" name="Imagen3" descr=""/>
+                    <pic:cNvPr id="4" name="Imagen3" descr=""/>
                     <pic:cNvPicPr>
                       <a:picLocks noChangeAspect="1" noChangeArrowheads="1"/>
                     </pic:cNvPicPr>
                   </pic:nvPicPr>
                   <pic:blipFill>
-                    <a:blip r:embed="rId5"/>
+                    <a:blip r:embed="rId6"/>
                     <a:stretch>
                       <a:fillRect/>
                     </a:stretch>
@@ -797,7 +931,7 @@
             <wp:extent cx="6120130" cy="3442335"/>
             <wp:effectExtent l="0" t="0" r="0" b="0"/>
             <wp:wrapSquare wrapText="largest"/>
-            <wp:docPr id="4" name="Imagen4" descr=""/>
+            <wp:docPr id="5" name="Imagen4" descr=""/>
             <wp:cNvGraphicFramePr>
               <a:graphicFrameLocks xmlns:a="http://schemas.openxmlformats.org/drawingml/2006/main" noChangeAspect="1"/>
             </wp:cNvGraphicFramePr>
@@ -805,13 +939,13 @@
               <a:graphicData uri="http://schemas.openxmlformats.org/drawingml/2006/picture">
                 <pic:pic xmlns:pic="http://schemas.openxmlformats.org/drawingml/2006/picture">
                   <pic:nvPicPr>
-                    <pic:cNvPr id="4" name="Imagen4" descr=""/>
+                    <pic:cNvPr id="5" name="Imagen4" descr=""/>
                     <pic:cNvPicPr>
                       <a:picLocks noChangeAspect="1" noChangeArrowheads="1"/>
                     </pic:cNvPicPr>
                   </pic:nvPicPr>
                   <pic:blipFill>
-                    <a:blip r:embed="rId6"/>
+                    <a:blip r:embed="rId7"/>
                     <a:stretch>
                       <a:fillRect/>
                     </a:stretch>
@@ -830,6 +964,51 @@
             </a:graphic>
           </wp:anchor>
         </w:drawing>
+        <w:drawing>
+          <wp:anchor behindDoc="0" distT="0" distB="0" distL="0" distR="0" simplePos="0" locked="0" layoutInCell="0" allowOverlap="1" relativeHeight="6">
+            <wp:simplePos x="0" y="0"/>
+            <wp:positionH relativeFrom="column">
+              <wp:align>center</wp:align>
+            </wp:positionH>
+            <wp:positionV relativeFrom="paragraph">
+              <wp:posOffset>635</wp:posOffset>
+            </wp:positionV>
+            <wp:extent cx="6120130" cy="3442335"/>
+            <wp:effectExtent l="0" t="0" r="0" b="0"/>
+            <wp:wrapSquare wrapText="largest"/>
+            <wp:docPr id="6" name="Imagen5" descr=""/>
+            <wp:cNvGraphicFramePr>
+              <a:graphicFrameLocks xmlns:a="http://schemas.openxmlformats.org/drawingml/2006/main" noChangeAspect="1"/>
+            </wp:cNvGraphicFramePr>
+            <a:graphic xmlns:a="http://schemas.openxmlformats.org/drawingml/2006/main">
+              <a:graphicData uri="http://schemas.openxmlformats.org/drawingml/2006/picture">
+                <pic:pic xmlns:pic="http://schemas.openxmlformats.org/drawingml/2006/picture">
+                  <pic:nvPicPr>
+                    <pic:cNvPr id="6" name="Imagen5" descr=""/>
+                    <pic:cNvPicPr>
+                      <a:picLocks noChangeAspect="1" noChangeArrowheads="1"/>
+                    </pic:cNvPicPr>
+                  </pic:nvPicPr>
+                  <pic:blipFill>
+                    <a:blip r:embed="rId8"/>
+                    <a:stretch>
+                      <a:fillRect/>
+                    </a:stretch>
+                  </pic:blipFill>
+                  <pic:spPr bwMode="auto">
+                    <a:xfrm>
+                      <a:off x="0" y="0"/>
+                      <a:ext cx="6120130" cy="3442335"/>
+                    </a:xfrm>
+                    <a:prstGeom prst="rect">
+                      <a:avLst/>
+                    </a:prstGeom>
+                  </pic:spPr>
+                </pic:pic>
+              </a:graphicData>
+            </a:graphic>
+          </wp:anchor>
+        </w:drawing>
       </w:r>
     </w:p>
     <w:sectPr>
@@ -839,6 +1018,7 @@
       <w:pgNumType w:fmt="decimal"/>
       <w:formProt w:val="false"/>
       <w:textDirection w:val="lrTb"/>
+      <w:docGrid w:type="default" w:linePitch="100" w:charSpace="0"/>
     </w:sectPr>
   </w:body>
 </w:document>
@@ -858,7 +1038,6 @@
     </w:rPrDefault>
     <w:pPrDefault>
       <w:pPr>
-        <w:widowControl/>
         <w:suppressAutoHyphens w:val="true"/>
       </w:pPr>
     </w:pPrDefault>
@@ -868,7 +1047,10 @@
     <w:qFormat/>
     <w:pPr>
       <w:widowControl/>
+      <w:suppressAutoHyphens w:val="true"/>
       <w:bidi w:val="0"/>
+      <w:spacing w:before="0" w:after="0"/>
+      <w:jc w:val="left"/>
     </w:pPr>
     <w:rPr>
       <w:rFonts w:ascii="Liberation Serif" w:hAnsi="Liberation Serif" w:eastAsia="NSimSun" w:cs="Lucida Sans"/>

</xml_diff>